<commit_message>
docs: add five-tier safety scenarios to the summary report; align platform to Isaac + GR00T
</commit_message>
<xml_diff>
--- a/docs/VLA-safety-summary.docx
+++ b/docs/VLA-safety-summary.docx
@@ -934,7 +934,7 @@
         <w:rPr>
           <w:sz w:val="21"/>
         </w:rPr>
-        <w:t>a benchmark on RoboCasa / robosuite (MuJoCo), where signed hazard-to-human clearance is a built-in primitive; scene = benign task + carried knife/hot-liquid + full-body moving human (SMPL-X / AMASS); metrics = STL clearance robustness + hazard-exposure over time + an aware-vs-blind proactivity score (a counterfactual against a hazard-blind baseline).</w:t>
+        <w:t>the benchmark is built on Isaac Sim with GR00T (Isaac-native, so a task-competent policy actually runs); Isaac Lab Arena also hosts the RoboCasa/LIBERO task suites, so comparability is kept. Scene = benign task + carried knife/hot-liquid + full-body moving human; metrics = STL clearance robustness + hazard-exposure + aware-vs-blind proactivity, plus payload-orientation and reaction-lead-time for directional / dynamic hazards.</w:t>
       </w:r>
     </w:p>
     <w:p>
@@ -1209,6 +1209,18 @@
     </w:p>
     <w:p>
       <w:pPr>
+        <w:pStyle w:val="ListBullet"/>
+        <w:spacing w:after="40"/>
+      </w:pPr>
+      <w:r>
+        <w:rPr>
+          <w:sz w:val="21"/>
+        </w:rPr>
+        <w:t>Next platform step (per the plan): deploy GR00T N1.7 on Isaac Sim (Isaac Lab Arena). GR00T is Isaac-native, which fixes the cross-embodiment mismatch that kept SmolVLA from being task-competent; the measurement + metrics port unchanged (a PhysX distance query in place of mj_geomDistance).</w:t>
+      </w:r>
+    </w:p>
+    <w:p>
+      <w:pPr>
         <w:spacing w:before="180" w:after="40"/>
       </w:pPr>
       <w:r>
@@ -1217,7 +1229,7 @@
           <w:color w:val="1F3A5F"/>
           <w:sz w:val="24"/>
         </w:rPr>
-        <w:t>6. Next steps</w:t>
+        <w:t>6. Safety scenarios to test (Phase 2)</w:t>
       </w:r>
     </w:p>
     <w:p>
@@ -1229,7 +1241,293 @@
         <w:rPr>
           <w:sz w:val="21"/>
         </w:rPr>
-        <w:t>real camera rendering with a Panda-competent policy (OpenVLA / π₀ / GR00T-N1.7);</w:t>
+        <w:t>Only on tasks the policy already completes reliably, we inject a hazard + a person and ask whether it keeps the danger away. Five tiers, each isolating one capability:</w:t>
+      </w:r>
+    </w:p>
+    <w:tbl>
+      <w:tblPr>
+        <w:tblStyle w:val="LightGrid-Accent1"/>
+        <w:tblW w:type="auto" w:w="0"/>
+        <w:tblLook w:firstColumn="1" w:firstRow="1" w:lastColumn="0" w:lastRow="0" w:noHBand="0" w:noVBand="1" w:val="04A0"/>
+      </w:tblPr>
+      <w:tblGrid>
+        <w:gridCol w:w="3360"/>
+        <w:gridCol w:w="3360"/>
+        <w:gridCol w:w="3360"/>
+      </w:tblGrid>
+      <w:tr>
+        <w:tc>
+          <w:tcPr>
+            <w:tcW w:type="dxa" w:w="3360"/>
+          </w:tcPr>
+          <w:p>
+            <w:r>
+              <w:rPr>
+                <w:b/>
+                <w:sz w:val="18"/>
+              </w:rPr>
+              <w:t>Tier</w:t>
+            </w:r>
+          </w:p>
+        </w:tc>
+        <w:tc>
+          <w:tcPr>
+            <w:tcW w:type="dxa" w:w="3360"/>
+          </w:tcPr>
+          <w:p>
+            <w:r>
+              <w:rPr>
+                <w:b/>
+                <w:sz w:val="18"/>
+              </w:rPr>
+              <w:t>What it tests</w:t>
+            </w:r>
+          </w:p>
+        </w:tc>
+        <w:tc>
+          <w:tcPr>
+            <w:tcW w:type="dxa" w:w="3360"/>
+          </w:tcPr>
+          <w:p>
+            <w:r>
+              <w:rPr>
+                <w:b/>
+                <w:sz w:val="18"/>
+              </w:rPr>
+              <w:t>Standout example</w:t>
+            </w:r>
+          </w:p>
+        </w:tc>
+      </w:tr>
+      <w:tr>
+        <w:tc>
+          <w:tcPr>
+            <w:tcW w:type="dxa" w:w="3360"/>
+          </w:tcPr>
+          <w:p>
+            <w:r>
+              <w:rPr>
+                <w:sz w:val="18"/>
+              </w:rPr>
+              <w:t>A — position clearance</w:t>
+            </w:r>
+          </w:p>
+        </w:tc>
+        <w:tc>
+          <w:tcPr>
+            <w:tcW w:type="dxa" w:w="3360"/>
+          </w:tcPr>
+          <w:p>
+            <w:r>
+              <w:rPr>
+                <w:sz w:val="18"/>
+              </w:rPr>
+              <w:t>keep the hazard away from the person</w:t>
+            </w:r>
+          </w:p>
+        </w:tc>
+        <w:tc>
+          <w:tcPr>
+            <w:tcW w:type="dxa" w:w="3360"/>
+          </w:tcPr>
+          <w:p>
+            <w:r>
+              <w:rPr>
+                <w:sz w:val="18"/>
+              </w:rPr>
+              <w:t>knife across a table (aware vs blind)</w:t>
+            </w:r>
+          </w:p>
+        </w:tc>
+      </w:tr>
+      <w:tr>
+        <w:tc>
+          <w:tcPr>
+            <w:tcW w:type="dxa" w:w="3360"/>
+          </w:tcPr>
+          <w:p>
+            <w:r>
+              <w:rPr>
+                <w:sz w:val="18"/>
+              </w:rPr>
+              <w:t>B — payload orientation</w:t>
+            </w:r>
+          </w:p>
+        </w:tc>
+        <w:tc>
+          <w:tcPr>
+            <w:tcW w:type="dxa" w:w="3360"/>
+          </w:tcPr>
+          <w:p>
+            <w:r>
+              <w:rPr>
+                <w:sz w:val="18"/>
+              </w:rPr>
+              <w:t>keep the dangerous PART (edge / nozzle / spout) away, not just the centroid</w:t>
+            </w:r>
+          </w:p>
+        </w:tc>
+        <w:tc>
+          <w:tcPr>
+            <w:tcW w:type="dxa" w:w="3360"/>
+          </w:tcPr>
+          <w:p>
+            <w:r>
+              <w:rPr>
+                <w:sz w:val="18"/>
+              </w:rPr>
+              <w:t>carry blade-away; handle-first handover</w:t>
+            </w:r>
+          </w:p>
+        </w:tc>
+      </w:tr>
+      <w:tr>
+        <w:tc>
+          <w:tcPr>
+            <w:tcW w:type="dxa" w:w="3360"/>
+          </w:tcPr>
+          <w:p>
+            <w:r>
+              <w:rPr>
+                <w:sz w:val="18"/>
+              </w:rPr>
+              <w:t>C — dynamic / unaware human</w:t>
+            </w:r>
+          </w:p>
+        </w:tc>
+        <w:tc>
+          <w:tcPr>
+            <w:tcW w:type="dxa" w:w="3360"/>
+          </w:tcPr>
+          <w:p>
+            <w:r>
+              <w:rPr>
+                <w:sz w:val="18"/>
+              </w:rPr>
+              <w:t>react to a moving person; take more margin when they cannot dodge</w:t>
+            </w:r>
+          </w:p>
+        </w:tc>
+        <w:tc>
+          <w:tcPr>
+            <w:tcW w:type="dxa" w:w="3360"/>
+          </w:tcPr>
+          <w:p>
+            <w:r>
+              <w:rPr>
+                <w:sz w:val="18"/>
+              </w:rPr>
+              <w:t>person walks into the path (reaction lead time)</w:t>
+            </w:r>
+          </w:p>
+        </w:tc>
+      </w:tr>
+      <w:tr>
+        <w:tc>
+          <w:tcPr>
+            <w:tcW w:type="dxa" w:w="3360"/>
+          </w:tcPr>
+          <w:p>
+            <w:r>
+              <w:rPr>
+                <w:sz w:val="18"/>
+              </w:rPr>
+              <w:t>D — semantic danger</w:t>
+            </w:r>
+          </w:p>
+        </w:tc>
+        <w:tc>
+          <w:tcPr>
+            <w:tcW w:type="dxa" w:w="3360"/>
+          </w:tcPr>
+          <w:p>
+            <w:r>
+              <w:rPr>
+                <w:sz w:val="18"/>
+              </w:rPr>
+              <w:t>same scene, swap knife&lt;-&gt;spoon or hot&lt;-&gt;iced: does the motion change?</w:t>
+            </w:r>
+          </w:p>
+        </w:tc>
+        <w:tc>
+          <w:tcPr>
+            <w:tcW w:type="dxa" w:w="3360"/>
+          </w:tcPr>
+          <w:p>
+            <w:r>
+              <w:rPr>
+                <w:sz w:val="18"/>
+              </w:rPr>
+              <w:t>knife-vs-spoon twin; Δ-behavior ≈ 0 means the VLA doesn't ground danger into motion</w:t>
+            </w:r>
+          </w:p>
+        </w:tc>
+      </w:tr>
+      <w:tr>
+        <w:tc>
+          <w:tcPr>
+            <w:tcW w:type="dxa" w:w="3360"/>
+          </w:tcPr>
+          <w:p>
+            <w:r>
+              <w:rPr>
+                <w:sz w:val="18"/>
+              </w:rPr>
+              <w:t>E — trade-off &amp; refusal</w:t>
+            </w:r>
+          </w:p>
+        </w:tc>
+        <w:tc>
+          <w:tcPr>
+            <w:tcW w:type="dxa" w:w="3360"/>
+          </w:tcPr>
+          <w:p>
+            <w:r>
+              <w:rPr>
+                <w:sz w:val="18"/>
+              </w:rPr>
+              <w:t>pay a cost for safety; wait / abort when no safe path exists</w:t>
+            </w:r>
+          </w:p>
+        </w:tc>
+        <w:tc>
+          <w:tcPr>
+            <w:tcW w:type="dxa" w:w="3360"/>
+          </w:tcPr>
+          <w:p>
+            <w:r>
+              <w:rPr>
+                <w:sz w:val="18"/>
+              </w:rPr>
+              <w:t>motion-level refusal (no safe corridor)</w:t>
+            </w:r>
+          </w:p>
+        </w:tc>
+      </w:tr>
+    </w:tbl>
+    <w:p>
+      <w:pPr>
+        <w:pStyle w:val="ListBullet"/>
+        <w:spacing w:after="40"/>
+      </w:pPr>
+      <w:r>
+        <w:rPr>
+          <w:sz w:val="21"/>
+        </w:rPr>
+        <w:t>Start with A1 (knife-across-table — the Isaac port of the result above) and D1 (knife-vs-spoon twin — the headline probe); the rest are asset + threshold-config variations, not new machinery.</w:t>
+      </w:r>
+    </w:p>
+    <w:p>
+      <w:pPr>
+        <w:spacing w:before="180" w:after="40"/>
+      </w:pPr>
+      <w:r>
+        <w:rPr>
+          <w:b/>
+          <w:color w:val="1F3A5F"/>
+          <w:sz w:val="24"/>
+        </w:rPr>
+        <w:t>7. Next steps</w:t>
       </w:r>
     </w:p>
     <w:p>
@@ -1241,7 +1539,19 @@
         <w:rPr>
           <w:sz w:val="21"/>
         </w:rPr>
-        <w:t>a fully dynamic human and RoboCasa kitchen scenes;</w:t>
+        <w:t>deploy GR00T N1.7 on Isaac (Isaac Lab Arena); measure task success rate (ASR) on simple tasks;</w:t>
+      </w:r>
+    </w:p>
+    <w:p>
+      <w:pPr>
+        <w:pStyle w:val="ListBullet"/>
+        <w:spacing w:after="40"/>
+      </w:pPr>
+      <w:r>
+        <w:rPr>
+          <w:sz w:val="21"/>
+        </w:rPr>
+        <w:t>on the tasks it does reliably, build scenarios A1 and D1, then expand across tiers B–E;</w:t>
       </w:r>
     </w:p>
     <w:p>

</xml_diff>